<commit_message>
Add PowerShell notes and port scanners
Adds a new PowerShell reference note covering execution policy, cmdlet naming, and DSC basics. Introduces two subnet port-enumeration scripts: one using background jobs for PowerShell 5 and one using `ForEach-Object -Parallel` for PowerShell 7. Also updates the enhanced IT resume document.
</commit_message>
<xml_diff>
--- a/Documents/Resume/Tristen_McDuff_Resume_IT_2026_ENHANCED_REDESIGN.docx
+++ b/Documents/Resume/Tristen_McDuff_Resume_IT_2026_ENHANCED_REDESIGN.docx
@@ -306,13 +306,12 @@
           <w:color w:val="1B3A5C"/>
           <w:sz w:val="18"/>
         </w:rPr>
-        <w:t xml:space="preserve">Scripting &amp; Automation: </w:t>
+        <w:t>Scripting &amp; Automation: PowerShell, Bash, Python (intermediate; NumPy)</w:t>
       </w:r>
       <w:r>
         <w:rPr>
           <w:sz w:val="18"/>
         </w:rPr>
-        <w:t>PowerShell, Bash, Python (foundational)</w:t>
       </w:r>
     </w:p>
     <w:p>
@@ -860,14 +859,15 @@
           <w:b/>
           <w:sz w:val="18"/>
         </w:rPr>
-        <w:t>AI Literacy Professional</w:t>
+        <w:t>AI Literacy Professional  —  Pearson — Feb 20, 2026 (Understanding / Using / Evaluating AI)</w:t>
+        <w:br/>
+        <w:t>Codédex: Intermediate Python, NumPy, Git &amp; GitHub, Command Line (Golden Course Badges) — Codédex.io</w:t>
       </w:r>
       <w:r>
         <w:rPr>
           <w:color w:val="5A6B7C"/>
           <w:sz w:val="17"/>
         </w:rPr>
-        <w:t xml:space="preserve">  —  Pearson — Feb 20, 2026 (Understanding / Using / Evaluating AI)</w:t>
       </w:r>
     </w:p>
     <w:p>
@@ -1213,6 +1213,12 @@
       </w:hyperlink>
     </w:p>
     <w:sectPr>
+      <w:headerReference w:type="default" r:id="rId14"/>
+      <w:footerReference w:type="default" r:id="rId15"/>
+      <w:headerReference w:type="first" r:id="rId16"/>
+      <w:footerReference w:type="first" r:id="rId17"/>
+      <w:headerReference w:type="even" r:id="rId18"/>
+      <w:footerReference w:type="even" r:id="rId19"/>
       <w:pgSz w:w="12240" w:h="15840"/>
       <w:pgMar w:top="792" w:right="936" w:bottom="720" w:left="936" w:header="720" w:footer="720" w:gutter="0"/>
       <w:cols w:space="720"/>
@@ -1220,6 +1226,66 @@
     </w:sectPr>
   </w:body>
 </w:document>
+</file>
+
+<file path=word/footer1.xml><?xml version="1.0" encoding="utf-8"?>
+<w:ftr xmlns:m="http://schemas.openxmlformats.org/officeDocument/2006/math" xmlns:mc="http://schemas.openxmlformats.org/markup-compatibility/2006" xmlns:mo="http://schemas.microsoft.com/office/mac/office/2008/main" xmlns:mv="urn:schemas-microsoft-com:mac:vml" xmlns:o="urn:schemas-microsoft-com:office:office" xmlns:r="http://schemas.openxmlformats.org/officeDocument/2006/relationships" xmlns:v="urn:schemas-microsoft-com:vml" xmlns:w10="urn:schemas-microsoft-com:office:word" xmlns:w14="http://schemas.microsoft.com/office/word/2010/wordml" xmlns:w="http://schemas.openxmlformats.org/wordprocessingml/2006/main" xmlns:wne="http://schemas.microsoft.com/office/word/2006/wordml" xmlns:wp14="http://schemas.microsoft.com/office/word/2010/wordprocessingDrawing" xmlns:wp="http://schemas.openxmlformats.org/drawingml/2006/wordprocessingDrawing" xmlns:wpc="http://schemas.microsoft.com/office/word/2010/wordprocessingCanvas" xmlns:wpg="http://schemas.microsoft.com/office/word/2010/wordprocessingGroup" xmlns:wpi="http://schemas.microsoft.com/office/word/2010/wordprocessingInk" xmlns:wps="http://schemas.microsoft.com/office/word/2010/wordprocessingShape" mc:Ignorable="w14 wp14">
+  <w:p>
+    <w:pPr>
+      <w:pStyle w:val="Footer"/>
+    </w:pPr>
+  </w:p>
+</w:ftr>
+</file>
+
+<file path=word/footer2.xml><?xml version="1.0" encoding="utf-8"?>
+<w:ftr xmlns:m="http://schemas.openxmlformats.org/officeDocument/2006/math" xmlns:mc="http://schemas.openxmlformats.org/markup-compatibility/2006" xmlns:mo="http://schemas.microsoft.com/office/mac/office/2008/main" xmlns:mv="urn:schemas-microsoft-com:mac:vml" xmlns:o="urn:schemas-microsoft-com:office:office" xmlns:r="http://schemas.openxmlformats.org/officeDocument/2006/relationships" xmlns:v="urn:schemas-microsoft-com:vml" xmlns:w10="urn:schemas-microsoft-com:office:word" xmlns:w14="http://schemas.microsoft.com/office/word/2010/wordml" xmlns:w="http://schemas.openxmlformats.org/wordprocessingml/2006/main" xmlns:wne="http://schemas.microsoft.com/office/word/2006/wordml" xmlns:wp14="http://schemas.microsoft.com/office/word/2010/wordprocessingDrawing" xmlns:wp="http://schemas.openxmlformats.org/drawingml/2006/wordprocessingDrawing" xmlns:wpc="http://schemas.microsoft.com/office/word/2010/wordprocessingCanvas" xmlns:wpg="http://schemas.microsoft.com/office/word/2010/wordprocessingGroup" xmlns:wpi="http://schemas.microsoft.com/office/word/2010/wordprocessingInk" xmlns:wps="http://schemas.microsoft.com/office/word/2010/wordprocessingShape" mc:Ignorable="w14 wp14">
+  <w:p>
+    <w:pPr>
+      <w:pStyle w:val="Footer"/>
+    </w:pPr>
+  </w:p>
+</w:ftr>
+</file>
+
+<file path=word/footer3.xml><?xml version="1.0" encoding="utf-8"?>
+<w:ftr xmlns:m="http://schemas.openxmlformats.org/officeDocument/2006/math" xmlns:mc="http://schemas.openxmlformats.org/markup-compatibility/2006" xmlns:mo="http://schemas.microsoft.com/office/mac/office/2008/main" xmlns:mv="urn:schemas-microsoft-com:mac:vml" xmlns:o="urn:schemas-microsoft-com:office:office" xmlns:r="http://schemas.openxmlformats.org/officeDocument/2006/relationships" xmlns:v="urn:schemas-microsoft-com:vml" xmlns:w10="urn:schemas-microsoft-com:office:word" xmlns:w14="http://schemas.microsoft.com/office/word/2010/wordml" xmlns:w="http://schemas.openxmlformats.org/wordprocessingml/2006/main" xmlns:wne="http://schemas.microsoft.com/office/word/2006/wordml" xmlns:wp14="http://schemas.microsoft.com/office/word/2010/wordprocessingDrawing" xmlns:wp="http://schemas.openxmlformats.org/drawingml/2006/wordprocessingDrawing" xmlns:wpc="http://schemas.microsoft.com/office/word/2010/wordprocessingCanvas" xmlns:wpg="http://schemas.microsoft.com/office/word/2010/wordprocessingGroup" xmlns:wpi="http://schemas.microsoft.com/office/word/2010/wordprocessingInk" xmlns:wps="http://schemas.microsoft.com/office/word/2010/wordprocessingShape" mc:Ignorable="w14 wp14">
+  <w:p>
+    <w:pPr>
+      <w:pStyle w:val="Footer"/>
+    </w:pPr>
+  </w:p>
+</w:ftr>
+</file>
+
+<file path=word/header1.xml><?xml version="1.0" encoding="utf-8"?>
+<w:hdr xmlns:m="http://schemas.openxmlformats.org/officeDocument/2006/math" xmlns:mc="http://schemas.openxmlformats.org/markup-compatibility/2006" xmlns:mo="http://schemas.microsoft.com/office/mac/office/2008/main" xmlns:mv="urn:schemas-microsoft-com:mac:vml" xmlns:o="urn:schemas-microsoft-com:office:office" xmlns:r="http://schemas.openxmlformats.org/officeDocument/2006/relationships" xmlns:v="urn:schemas-microsoft-com:vml" xmlns:w10="urn:schemas-microsoft-com:office:word" xmlns:w14="http://schemas.microsoft.com/office/word/2010/wordml" xmlns:w="http://schemas.openxmlformats.org/wordprocessingml/2006/main" xmlns:wne="http://schemas.microsoft.com/office/word/2006/wordml" xmlns:wp14="http://schemas.microsoft.com/office/word/2010/wordprocessingDrawing" xmlns:wp="http://schemas.openxmlformats.org/drawingml/2006/wordprocessingDrawing" xmlns:wpc="http://schemas.microsoft.com/office/word/2010/wordprocessingCanvas" xmlns:wpg="http://schemas.microsoft.com/office/word/2010/wordprocessingGroup" xmlns:wpi="http://schemas.microsoft.com/office/word/2010/wordprocessingInk" xmlns:wps="http://schemas.microsoft.com/office/word/2010/wordprocessingShape" mc:Ignorable="w14 wp14">
+  <w:p>
+    <w:pPr>
+      <w:pStyle w:val="Header"/>
+    </w:pPr>
+  </w:p>
+</w:hdr>
+</file>
+
+<file path=word/header2.xml><?xml version="1.0" encoding="utf-8"?>
+<w:hdr xmlns:m="http://schemas.openxmlformats.org/officeDocument/2006/math" xmlns:mc="http://schemas.openxmlformats.org/markup-compatibility/2006" xmlns:mo="http://schemas.microsoft.com/office/mac/office/2008/main" xmlns:mv="urn:schemas-microsoft-com:mac:vml" xmlns:o="urn:schemas-microsoft-com:office:office" xmlns:r="http://schemas.openxmlformats.org/officeDocument/2006/relationships" xmlns:v="urn:schemas-microsoft-com:vml" xmlns:w10="urn:schemas-microsoft-com:office:word" xmlns:w14="http://schemas.microsoft.com/office/word/2010/wordml" xmlns:w="http://schemas.openxmlformats.org/wordprocessingml/2006/main" xmlns:wne="http://schemas.microsoft.com/office/word/2006/wordml" xmlns:wp14="http://schemas.microsoft.com/office/word/2010/wordprocessingDrawing" xmlns:wp="http://schemas.openxmlformats.org/drawingml/2006/wordprocessingDrawing" xmlns:wpc="http://schemas.microsoft.com/office/word/2010/wordprocessingCanvas" xmlns:wpg="http://schemas.microsoft.com/office/word/2010/wordprocessingGroup" xmlns:wpi="http://schemas.microsoft.com/office/word/2010/wordprocessingInk" xmlns:wps="http://schemas.microsoft.com/office/word/2010/wordprocessingShape" mc:Ignorable="w14 wp14">
+  <w:p>
+    <w:pPr>
+      <w:pStyle w:val="Header"/>
+    </w:pPr>
+  </w:p>
+</w:hdr>
+</file>
+
+<file path=word/header3.xml><?xml version="1.0" encoding="utf-8"?>
+<w:hdr xmlns:m="http://schemas.openxmlformats.org/officeDocument/2006/math" xmlns:mc="http://schemas.openxmlformats.org/markup-compatibility/2006" xmlns:mo="http://schemas.microsoft.com/office/mac/office/2008/main" xmlns:mv="urn:schemas-microsoft-com:mac:vml" xmlns:o="urn:schemas-microsoft-com:office:office" xmlns:r="http://schemas.openxmlformats.org/officeDocument/2006/relationships" xmlns:v="urn:schemas-microsoft-com:vml" xmlns:w10="urn:schemas-microsoft-com:office:word" xmlns:w14="http://schemas.microsoft.com/office/word/2010/wordml" xmlns:w="http://schemas.openxmlformats.org/wordprocessingml/2006/main" xmlns:wne="http://schemas.microsoft.com/office/word/2006/wordml" xmlns:wp14="http://schemas.microsoft.com/office/word/2010/wordprocessingDrawing" xmlns:wp="http://schemas.openxmlformats.org/drawingml/2006/wordprocessingDrawing" xmlns:wpc="http://schemas.microsoft.com/office/word/2010/wordprocessingCanvas" xmlns:wpg="http://schemas.microsoft.com/office/word/2010/wordprocessingGroup" xmlns:wpi="http://schemas.microsoft.com/office/word/2010/wordprocessingInk" xmlns:wps="http://schemas.microsoft.com/office/word/2010/wordprocessingShape" mc:Ignorable="w14 wp14">
+  <w:p>
+    <w:pPr>
+      <w:pStyle w:val="Header"/>
+    </w:pPr>
+  </w:p>
+</w:hdr>
 </file>
 
 <file path=word/numbering.xml><?xml version="1.0" encoding="utf-8"?>

</xml_diff>